<commit_message>
Ask DBGI the open decisions at the end of the portal deck
The "Using the DBGI Portal" deck now ends with an intro slide, one
slide per question from DECISIONS_TO_MAKE (what it means, what the
portal does today, lettered choices, and how to reply), and a reply
slide listing every question id. The slides are generated from the
same Markdown as the printable sheet, so ids and wording match.

Reword the questions for people answering on their own by email, add
the missing "today" behaviour for D2 to D4, and point the roadmap's
next step at sending the deck.

Co-Authored-By: Claude Opus 5.5 <noreply@anthropic.com>
</commit_message>
<xml_diff>
--- a/docs/guides/Decision Questions/DBGI Portal Decisions.docx
+++ b/docs/guides/Decision Questions/DBGI Portal Decisions.docx
@@ -128,7 +128,41 @@
         <w:t xml:space="preserve">Part A</w:t>
       </w:r>
       <w:r>
-        <w:t xml:space="preserve">. If an answer there is a surprise, discuss it before continuing.</w:t>
+        <w:t xml:space="preserve">. If an answer there is a surprise, say so before continuing.</w:t>
+      </w:r>
+    </w:p>
+    <w:p>
+      <w:pPr>
+        <w:pStyle w:val="ListParagraph"/>
+        <w:numPr>
+          <w:ilvl w:val="0"/>
+          <w:numId w:val="1"/>
+        </w:numPr>
+      </w:pPr>
+      <w:r>
+        <w:t xml:space="preserve">The same questions, with the same ids, are at the end of the </w:t>
+      </w:r>
+      <w:r>
+        <w:rPr>
+          <w:b/>
+          <w:bCs/>
+        </w:rPr>
+        <w:t xml:space="preserve">Using the DBGI Portal</w:t>
+      </w:r>
+      <w:r>
+        <w:t xml:space="preserve"> slides. Its walkthrough slides show the screens they refer to.</w:t>
+      </w:r>
+    </w:p>
+    <w:p>
+      <w:pPr>
+        <w:pStyle w:val="ListParagraph"/>
+        <w:numPr>
+          <w:ilvl w:val="0"/>
+          <w:numId w:val="1"/>
+        </w:numPr>
+      </w:pPr>
+      <w:r>
+        <w:t xml:space="preserve">Skip anything outside your area, and return the sheet to the person who sent it.</w:t>
       </w:r>
     </w:p>
     <w:p>
@@ -281,7 +315,7 @@
         <w:t xml:space="preserve">Ask: </w:t>
       </w:r>
       <w:r>
-        <w:t xml:space="preserve">"Walk me through what happens today when a partner tells you about a government deal. Where does the portal differ?"</w:t>
+        <w:t xml:space="preserve">What happens today when a partner tells DBGI about a government deal? Where does the portal differ from that?</w:t>
       </w:r>
     </w:p>
     <w:p>
@@ -472,7 +506,7 @@
         <w:t xml:space="preserve">Ask: </w:t>
       </w:r>
       <w:r>
-        <w:t xml:space="preserve">"Can I see the current spreadsheet or emails for a recent deal?" (Without partner names, if sensitive.)</w:t>
+        <w:t xml:space="preserve">What do you use today (spreadsheet, email, chat)? If you can, attach an example from a recent deal, with partner names removed.</w:t>
       </w:r>
     </w:p>
     <w:p>
@@ -1103,7 +1137,7 @@
         <w:t xml:space="preserve">Ask: </w:t>
       </w:r>
       <w:r>
-        <w:t xml:space="preserve">"Would a partner understand these? What do you call them today?"</w:t>
+        <w:t xml:space="preserve">Would a partner understand these labels? What words do you use for them today?</w:t>
       </w:r>
     </w:p>
     <w:p>
@@ -3832,7 +3866,7 @@
         <w:t xml:space="preserve">Ask: </w:t>
       </w:r>
       <w:r>
-        <w:t xml:space="preserve">"What does DBGI check today before honouring a repeat order at the special price?"</w:t>
+        <w:t xml:space="preserve">What does DBGI check today before honouring a repeat order at the special price?</w:t>
       </w:r>
     </w:p>
     <w:p>
@@ -3956,7 +3990,7 @@
         <w:t xml:space="preserve">Means: </w:t>
       </w:r>
       <w:r>
-        <w:t xml:space="preserve">today every active user at the partner company receives the notifications. DBGI staff get none and work from the dashboard.</w:t>
+        <w:t xml:space="preserve">which people receive the portal's email notifications, on the partner side and at DBGI.</w:t>
       </w:r>
     </w:p>
     <w:p>
@@ -3981,6 +4015,9 @@
         </w:rPr>
         <w:t xml:space="preserve">Portal today: </w:t>
       </w:r>
+      <w:r>
+        <w:t xml:space="preserve">every active user at the partner company receives each notification. DBGI staff get no emails and work from the dashboard queues.</w:t>
+      </w:r>
     </w:p>
     <w:p>
       <w:pPr>
@@ -4023,7 +4060,7 @@
         <w:t xml:space="preserve">☐</w:t>
       </w:r>
       <w:r>
-        <w:t xml:space="preserve">  (a) keep it</w:t>
+        <w:t xml:space="preserve">  (a) keep today's rule</w:t>
       </w:r>
     </w:p>
     <w:p>
@@ -4169,6 +4206,9 @@
         </w:rPr>
         <w:t xml:space="preserve">Portal today: </w:t>
       </w:r>
+      <w:r>
+        <w:t xml:space="preserve">the portal is not in production yet. Nothing is deleted automatically, and no backup schedule exists.</w:t>
+      </w:r>
     </w:p>
     <w:p>
       <w:pPr>
@@ -4310,7 +4350,7 @@
         <w:t xml:space="preserve">Means: </w:t>
       </w:r>
       <w:r>
-        <w:t xml:space="preserve">deadlines like "one working day" need a definition. The portal uses Philippine time.</w:t>
+        <w:t xml:space="preserve">deadlines like "one working day" need a definition.</w:t>
       </w:r>
     </w:p>
     <w:p>
@@ -4334,6 +4374,9 @@
           <w:color w:val="12384D"/>
         </w:rPr>
         <w:t xml:space="preserve">Portal today: </w:t>
+      </w:r>
+      <w:r>
+        <w:t xml:space="preserve">the portal uses Philippine time and counts calendar days (for example, a renewal adds 30 calendar days). There are no working-day or holiday rules.</w:t>
       </w:r>
     </w:p>
     <w:p>

</xml_diff>